<commit_message>
docs: correct live governance-check count to 32/32 (verified live in ENFORCE) + regenerate decks/guides
</commit_message>
<xml_diff>
--- a/docs/PV-AgentCore-Maintenance.docx
+++ b/docs/PV-AgentCore-Maintenance.docx
@@ -693,7 +693,7 @@
           <w:sz w:val="17"/>
           <w:szCs w:val="17"/>
         </w:rPr>
-        <w:t xml:space="preserve">bash lib/engine/demo.sh    agents/pharmacovigilance   # smoke test: expect 30/30</w:t>
+        <w:t xml:space="preserve">bash lib/engine/demo.sh    agents/pharmacovigilance   # smoke test: expect 32/32</w:t>
       </w:r>
     </w:p>
     <w:p>
@@ -1671,7 +1671,7 @@
         <w:t xml:space="preserve">bash lib/engine/demo.sh agents/pharmacovigilance</w:t>
       </w:r>
       <w:r>
-        <w:t xml:space="preserve"> is the fastest health check — 30/30 means the whole governed path is intact; </w:t>
+        <w:t xml:space="preserve"> is the fastest health check — 32/32 means the whole governed path is intact; </w:t>
       </w:r>
       <w:r>
         <w:rPr>

</xml_diff>